<commit_message>
Update Systeem-Audit 30-09-2026 09:20
</commit_message>
<xml_diff>
--- a/docx/document-0.docx
+++ b/docx/document-0.docx
@@ -7,7 +7,7 @@
         <w:spacing w:after="480"/>
         <w:jc w:val="center"/>
         <w:outlineLvl w:val="1"/>
-        <w:divId w:val="441459091"/>
+        <w:divId w:val="982395197"/>
         <w:rPr>
           <w:rFonts w:ascii="Aptos Display" w:eastAsia="Times New Roman" w:hAnsi="Aptos Display"/>
           <w:b/>
@@ -36,7 +36,7 @@
     <w:p>
       <w:pPr>
         <w:pStyle w:val="ondertitel2"/>
-        <w:divId w:val="441459091"/>
+        <w:divId w:val="982395197"/>
         <w:rPr>
           <w:lang w:val="nl-NL"/>
         </w:rPr>
@@ -51,7 +51,7 @@
     <w:p>
       <w:pPr>
         <w:pStyle w:val="documentaanduiding2"/>
-        <w:divId w:val="441459091"/>
+        <w:divId w:val="982395197"/>
         <w:rPr>
           <w:lang w:val="nl-NL"/>
         </w:rPr>
@@ -66,7 +66,7 @@
     <w:p>
       <w:pPr>
         <w:pStyle w:val="auteur2"/>
-        <w:divId w:val="441459091"/>
+        <w:divId w:val="982395197"/>
         <w:rPr>
           <w:lang w:val="nl-NL"/>
         </w:rPr>
@@ -81,23 +81,23 @@
     <w:p>
       <w:pPr>
         <w:pStyle w:val="meta-lijn2"/>
-        <w:divId w:val="441459091"/>
-        <w:rPr>
-          <w:lang w:val="nl-NL"/>
-        </w:rPr>
-      </w:pPr>
-      <w:r>
-        <w:rPr>
-          <w:lang w:val="nl-NL"/>
-        </w:rPr>
-        <w:t>Versie bijgewerkt: 30 september 2026</w:t>
+        <w:divId w:val="982395197"/>
+        <w:rPr>
+          <w:lang w:val="nl-NL"/>
+        </w:rPr>
+      </w:pPr>
+      <w:r>
+        <w:rPr>
+          <w:lang w:val="nl-NL"/>
+        </w:rPr>
+        <w:t>Versie bijgewerkt: 30 september 2026, 09:20</w:t>
       </w:r>
     </w:p>
     <w:p>
       <w:pPr>
         <w:pStyle w:val="marker"/>
         <w:ind w:left="800" w:right="800"/>
-        <w:divId w:val="915238564"/>
+        <w:divId w:val="2075817173"/>
         <w:rPr>
           <w:lang w:val="nl-NL"/>
         </w:rPr>
@@ -110,13 +110,13 @@
       <w:pPr>
         <w:pStyle w:val="Kop2"/>
         <w:pageBreakBefore/>
-        <w:divId w:val="303313703"/>
+        <w:divId w:val="214781378"/>
         <w:rPr>
           <w:rFonts w:eastAsia="Times New Roman"/>
           <w:lang w:val="nl-NL"/>
         </w:rPr>
       </w:pPr>
-      <w:bookmarkStart w:id="0" w:name="_Toc241651040"/>
+      <w:bookmarkStart w:id="0" w:name="_Toc241652508"/>
       <w:r>
         <w:rPr>
           <w:rFonts w:eastAsia="Times New Roman"/>
@@ -133,7 +133,7 @@
         <w:tabs>
           <w:tab w:val="right" w:leader="dot" w:pos="9062"/>
         </w:tabs>
-        <w:divId w:val="303313703"/>
+        <w:divId w:val="214781378"/>
         <w:rPr>
           <w:rFonts w:asciiTheme="minorHAnsi" w:hAnsiTheme="minorHAnsi" w:cstheme="minorBidi"/>
           <w:noProof/>
@@ -184,7 +184,7 @@
         <w:rPr>
           <w:noProof/>
         </w:rPr>
-        <w:instrText xml:space="preserve"> PAGEREF _Toc241651040 \h </w:instrText>
+        <w:instrText xml:space="preserve"> PAGEREF _Toc241652508 \h </w:instrText>
       </w:r>
       <w:r>
         <w:rPr>
@@ -216,7 +216,7 @@
         <w:tabs>
           <w:tab w:val="right" w:leader="dot" w:pos="9062"/>
         </w:tabs>
-        <w:divId w:val="303313703"/>
+        <w:divId w:val="214781378"/>
         <w:rPr>
           <w:rFonts w:asciiTheme="minorHAnsi" w:hAnsiTheme="minorHAnsi" w:cstheme="minorBidi"/>
           <w:noProof/>
@@ -249,7 +249,7 @@
         <w:rPr>
           <w:noProof/>
         </w:rPr>
-        <w:instrText xml:space="preserve"> PAGEREF _Toc241651041 \h </w:instrText>
+        <w:instrText xml:space="preserve"> PAGEREF _Toc241652509 \h </w:instrText>
       </w:r>
       <w:r>
         <w:rPr>
@@ -281,7 +281,7 @@
         <w:tabs>
           <w:tab w:val="right" w:leader="dot" w:pos="9062"/>
         </w:tabs>
-        <w:divId w:val="303313703"/>
+        <w:divId w:val="214781378"/>
         <w:rPr>
           <w:rFonts w:asciiTheme="minorHAnsi" w:hAnsiTheme="minorHAnsi" w:cstheme="minorBidi"/>
           <w:noProof/>
@@ -314,7 +314,7 @@
         <w:rPr>
           <w:noProof/>
         </w:rPr>
-        <w:instrText xml:space="preserve"> PAGEREF _Toc241651042 \h </w:instrText>
+        <w:instrText xml:space="preserve"> PAGEREF _Toc241652510 \h </w:instrText>
       </w:r>
       <w:r>
         <w:rPr>
@@ -346,7 +346,7 @@
         <w:tabs>
           <w:tab w:val="right" w:leader="dot" w:pos="9062"/>
         </w:tabs>
-        <w:divId w:val="303313703"/>
+        <w:divId w:val="214781378"/>
         <w:rPr>
           <w:rFonts w:asciiTheme="minorHAnsi" w:hAnsiTheme="minorHAnsi" w:cstheme="minorBidi"/>
           <w:noProof/>
@@ -379,7 +379,7 @@
         <w:rPr>
           <w:noProof/>
         </w:rPr>
-        <w:instrText xml:space="preserve"> PAGEREF _Toc241651043 \h </w:instrText>
+        <w:instrText xml:space="preserve"> PAGEREF _Toc241652511 \h </w:instrText>
       </w:r>
       <w:r>
         <w:rPr>
@@ -411,7 +411,7 @@
         <w:tabs>
           <w:tab w:val="right" w:leader="dot" w:pos="9062"/>
         </w:tabs>
-        <w:divId w:val="303313703"/>
+        <w:divId w:val="214781378"/>
         <w:rPr>
           <w:rFonts w:asciiTheme="minorHAnsi" w:hAnsiTheme="minorHAnsi" w:cstheme="minorBidi"/>
           <w:noProof/>
@@ -444,7 +444,7 @@
         <w:rPr>
           <w:noProof/>
         </w:rPr>
-        <w:instrText xml:space="preserve"> PAGEREF _Toc241651044 \h </w:instrText>
+        <w:instrText xml:space="preserve"> PAGEREF _Toc241652512 \h </w:instrText>
       </w:r>
       <w:r>
         <w:rPr>
@@ -476,7 +476,7 @@
         <w:tabs>
           <w:tab w:val="right" w:leader="dot" w:pos="9062"/>
         </w:tabs>
-        <w:divId w:val="303313703"/>
+        <w:divId w:val="214781378"/>
         <w:rPr>
           <w:rFonts w:asciiTheme="minorHAnsi" w:hAnsiTheme="minorHAnsi" w:cstheme="minorBidi"/>
           <w:noProof/>
@@ -509,7 +509,7 @@
         <w:rPr>
           <w:noProof/>
         </w:rPr>
-        <w:instrText xml:space="preserve"> PAGEREF _Toc241651045 \h </w:instrText>
+        <w:instrText xml:space="preserve"> PAGEREF _Toc241652513 \h </w:instrText>
       </w:r>
       <w:r>
         <w:rPr>
@@ -541,7 +541,7 @@
         <w:tabs>
           <w:tab w:val="right" w:leader="dot" w:pos="9062"/>
         </w:tabs>
-        <w:divId w:val="303313703"/>
+        <w:divId w:val="214781378"/>
         <w:rPr>
           <w:rFonts w:asciiTheme="minorHAnsi" w:hAnsiTheme="minorHAnsi" w:cstheme="minorBidi"/>
           <w:noProof/>
@@ -574,7 +574,7 @@
         <w:rPr>
           <w:noProof/>
         </w:rPr>
-        <w:instrText xml:space="preserve"> PAGEREF _Toc241651046 \h </w:instrText>
+        <w:instrText xml:space="preserve"> PAGEREF _Toc241652514 \h </w:instrText>
       </w:r>
       <w:r>
         <w:rPr>
@@ -606,7 +606,7 @@
         <w:tabs>
           <w:tab w:val="right" w:leader="dot" w:pos="9062"/>
         </w:tabs>
-        <w:divId w:val="303313703"/>
+        <w:divId w:val="214781378"/>
         <w:rPr>
           <w:rFonts w:asciiTheme="minorHAnsi" w:hAnsiTheme="minorHAnsi" w:cstheme="minorBidi"/>
           <w:noProof/>
@@ -639,7 +639,7 @@
         <w:rPr>
           <w:noProof/>
         </w:rPr>
-        <w:instrText xml:space="preserve"> PAGEREF _Toc241651047 \h </w:instrText>
+        <w:instrText xml:space="preserve"> PAGEREF _Toc241652515 \h </w:instrText>
       </w:r>
       <w:r>
         <w:rPr>
@@ -671,7 +671,7 @@
         <w:tabs>
           <w:tab w:val="right" w:leader="dot" w:pos="9062"/>
         </w:tabs>
-        <w:divId w:val="303313703"/>
+        <w:divId w:val="214781378"/>
         <w:rPr>
           <w:rFonts w:asciiTheme="minorHAnsi" w:hAnsiTheme="minorHAnsi" w:cstheme="minorBidi"/>
           <w:noProof/>
@@ -704,7 +704,7 @@
         <w:rPr>
           <w:noProof/>
         </w:rPr>
-        <w:instrText xml:space="preserve"> PAGEREF _Toc241651048 \h </w:instrText>
+        <w:instrText xml:space="preserve"> PAGEREF _Toc241652516 \h </w:instrText>
       </w:r>
       <w:r>
         <w:rPr>
@@ -736,7 +736,7 @@
         <w:tabs>
           <w:tab w:val="right" w:leader="dot" w:pos="9062"/>
         </w:tabs>
-        <w:divId w:val="303313703"/>
+        <w:divId w:val="214781378"/>
         <w:rPr>
           <w:rFonts w:asciiTheme="minorHAnsi" w:hAnsiTheme="minorHAnsi" w:cstheme="minorBidi"/>
           <w:noProof/>
@@ -769,7 +769,7 @@
         <w:rPr>
           <w:noProof/>
         </w:rPr>
-        <w:instrText xml:space="preserve"> PAGEREF _Toc241651049 \h </w:instrText>
+        <w:instrText xml:space="preserve"> PAGEREF _Toc241652517 \h </w:instrText>
       </w:r>
       <w:r>
         <w:rPr>
@@ -801,7 +801,7 @@
         <w:tabs>
           <w:tab w:val="right" w:leader="dot" w:pos="9062"/>
         </w:tabs>
-        <w:divId w:val="303313703"/>
+        <w:divId w:val="214781378"/>
         <w:rPr>
           <w:rFonts w:asciiTheme="minorHAnsi" w:hAnsiTheme="minorHAnsi" w:cstheme="minorBidi"/>
           <w:noProof/>
@@ -834,7 +834,7 @@
         <w:rPr>
           <w:noProof/>
         </w:rPr>
-        <w:instrText xml:space="preserve"> PAGEREF _Toc241651050 \h </w:instrText>
+        <w:instrText xml:space="preserve"> PAGEREF _Toc241652518 \h </w:instrText>
       </w:r>
       <w:r>
         <w:rPr>
@@ -866,7 +866,7 @@
         <w:tabs>
           <w:tab w:val="right" w:leader="dot" w:pos="9062"/>
         </w:tabs>
-        <w:divId w:val="303313703"/>
+        <w:divId w:val="214781378"/>
         <w:rPr>
           <w:rFonts w:asciiTheme="minorHAnsi" w:hAnsiTheme="minorHAnsi" w:cstheme="minorBidi"/>
           <w:noProof/>
@@ -899,7 +899,7 @@
         <w:rPr>
           <w:noProof/>
         </w:rPr>
-        <w:instrText xml:space="preserve"> PAGEREF _Toc241651051 \h </w:instrText>
+        <w:instrText xml:space="preserve"> PAGEREF _Toc241652519 \h </w:instrText>
       </w:r>
       <w:r>
         <w:rPr>
@@ -928,7 +928,7 @@
     <w:p>
       <w:pPr>
         <w:pStyle w:val="marker"/>
-        <w:divId w:val="303313703"/>
+        <w:divId w:val="214781378"/>
         <w:rPr>
           <w:lang w:val="nl-NL"/>
         </w:rPr>
@@ -944,7 +944,7 @@
       <w:pPr>
         <w:pStyle w:val="marker"/>
         <w:ind w:left="800" w:right="800"/>
-        <w:divId w:val="915238564"/>
+        <w:divId w:val="2075817173"/>
         <w:rPr>
           <w:lang w:val="nl-NL"/>
         </w:rPr>
@@ -956,13 +956,13 @@
     <w:p>
       <w:pPr>
         <w:pStyle w:val="Kop2"/>
-        <w:divId w:val="915238564"/>
+        <w:divId w:val="2075817173"/>
         <w:rPr>
           <w:rFonts w:eastAsia="Times New Roman"/>
           <w:lang w:val="nl-NL"/>
         </w:rPr>
       </w:pPr>
-      <w:bookmarkStart w:id="1" w:name="_Toc241651041"/>
+      <w:bookmarkStart w:id="1" w:name="_Toc241652509"/>
       <w:r>
         <w:rPr>
           <w:rFonts w:eastAsia="Times New Roman"/>
@@ -975,7 +975,7 @@
     <w:p>
       <w:pPr>
         <w:pStyle w:val="Normaalweb"/>
-        <w:divId w:val="915238564"/>
+        <w:divId w:val="2075817173"/>
         <w:rPr>
           <w:lang w:val="nl-NL"/>
         </w:rPr>
@@ -990,7 +990,7 @@
     <w:p>
       <w:pPr>
         <w:pStyle w:val="Normaalweb"/>
-        <w:divId w:val="915238564"/>
+        <w:divId w:val="2075817173"/>
         <w:rPr>
           <w:lang w:val="nl-NL"/>
         </w:rPr>
@@ -1018,7 +1018,7 @@
     <w:p>
       <w:pPr>
         <w:pStyle w:val="Normaalweb"/>
-        <w:divId w:val="915238564"/>
+        <w:divId w:val="2075817173"/>
         <w:rPr>
           <w:lang w:val="nl-NL"/>
         </w:rPr>
@@ -1039,7 +1039,7 @@
     <w:p>
       <w:pPr>
         <w:pStyle w:val="Normaalweb"/>
-        <w:divId w:val="915238564"/>
+        <w:divId w:val="2075817173"/>
         <w:rPr>
           <w:lang w:val="nl-NL"/>
         </w:rPr>
@@ -1086,7 +1086,7 @@
     <w:p>
       <w:pPr>
         <w:pStyle w:val="Normaalweb"/>
-        <w:divId w:val="915238564"/>
+        <w:divId w:val="2075817173"/>
         <w:rPr>
           <w:lang w:val="nl-NL"/>
         </w:rPr>
@@ -1107,7 +1107,7 @@
     <w:p>
       <w:pPr>
         <w:pStyle w:val="Normaalweb"/>
-        <w:divId w:val="915238564"/>
+        <w:divId w:val="2075817173"/>
         <w:rPr>
           <w:lang w:val="nl-NL"/>
         </w:rPr>
@@ -1142,7 +1142,7 @@
     <w:p>
       <w:pPr>
         <w:pStyle w:val="Normaalweb"/>
-        <w:divId w:val="915238564"/>
+        <w:divId w:val="2075817173"/>
         <w:rPr>
           <w:lang w:val="nl-NL"/>
         </w:rPr>
@@ -1169,7 +1169,7 @@
     <w:p>
       <w:pPr>
         <w:pStyle w:val="Normaalweb"/>
-        <w:divId w:val="915238564"/>
+        <w:divId w:val="2075817173"/>
         <w:rPr>
           <w:lang w:val="nl-NL"/>
         </w:rPr>
@@ -1197,7 +1197,7 @@
     <w:p>
       <w:pPr>
         <w:pStyle w:val="Normaalweb"/>
-        <w:divId w:val="915238564"/>
+        <w:divId w:val="2075817173"/>
         <w:rPr>
           <w:lang w:val="nl-NL"/>
         </w:rPr>
@@ -1212,7 +1212,7 @@
     <w:p>
       <w:pPr>
         <w:pStyle w:val="Normaalweb"/>
-        <w:divId w:val="915238564"/>
+        <w:divId w:val="2075817173"/>
         <w:rPr>
           <w:lang w:val="nl-NL"/>
         </w:rPr>
@@ -1278,7 +1278,7 @@
     <w:p>
       <w:pPr>
         <w:pStyle w:val="Normaalweb"/>
-        <w:divId w:val="915238564"/>
+        <w:divId w:val="2075817173"/>
         <w:rPr>
           <w:lang w:val="nl-NL"/>
         </w:rPr>
@@ -1293,7 +1293,7 @@
     <w:p>
       <w:pPr>
         <w:pStyle w:val="Normaalweb"/>
-        <w:divId w:val="915238564"/>
+        <w:divId w:val="2075817173"/>
         <w:rPr>
           <w:lang w:val="nl-NL"/>
         </w:rPr>
@@ -1321,7 +1321,7 @@
     <w:p>
       <w:pPr>
         <w:pStyle w:val="Normaalweb"/>
-        <w:divId w:val="915238564"/>
+        <w:divId w:val="2075817173"/>
         <w:rPr>
           <w:lang w:val="nl-NL"/>
         </w:rPr>
@@ -1336,7 +1336,7 @@
     <w:p>
       <w:pPr>
         <w:pStyle w:val="Normaalweb"/>
-        <w:divId w:val="915238564"/>
+        <w:divId w:val="2075817173"/>
         <w:rPr>
           <w:lang w:val="nl-NL"/>
         </w:rPr>
@@ -1351,7 +1351,7 @@
     <w:p>
       <w:pPr>
         <w:pStyle w:val="Normaalweb"/>
-        <w:divId w:val="915238564"/>
+        <w:divId w:val="2075817173"/>
         <w:rPr>
           <w:lang w:val="nl-NL"/>
         </w:rPr>
@@ -1366,7 +1366,7 @@
     <w:p>
       <w:pPr>
         <w:spacing w:before="300" w:after="200"/>
-        <w:divId w:val="915238564"/>
+        <w:divId w:val="2075817173"/>
         <w:rPr>
           <w:rFonts w:eastAsia="Times New Roman"/>
           <w:lang w:val="nl-NL"/>
@@ -1377,14 +1377,14 @@
           <w:rFonts w:eastAsia="Times New Roman"/>
           <w:lang w:val="nl-NL"/>
         </w:rPr>
-        <w:pict w14:anchorId="0101D9E9">
+        <w:pict w14:anchorId="39FD6073">
           <v:rect id="_x0000_i1025" style="width:0;height:1.5pt" o:hralign="center" o:hrstd="t" o:hr="t" fillcolor="#a0a0a0" stroked="f"/>
         </w:pict>
       </w:r>
     </w:p>
     <w:p>
       <w:pPr>
-        <w:divId w:val="1972132291"/>
+        <w:divId w:val="416295621"/>
         <w:rPr>
           <w:color w:val="555555"/>
           <w:sz w:val="20"/>
@@ -1423,7 +1423,7 @@
     </w:p>
     <w:p>
       <w:pPr>
-        <w:divId w:val="1972132291"/>
+        <w:divId w:val="416295621"/>
         <w:rPr>
           <w:color w:val="555555"/>
           <w:sz w:val="20"/>
@@ -1453,7 +1453,7 @@
     </w:p>
     <w:p>
       <w:pPr>
-        <w:divId w:val="1972132291"/>
+        <w:divId w:val="416295621"/>
         <w:rPr>
           <w:color w:val="555555"/>
           <w:sz w:val="20"/>
@@ -1493,7 +1493,7 @@
     </w:p>
     <w:p>
       <w:pPr>
-        <w:divId w:val="1972132291"/>
+        <w:divId w:val="416295621"/>
         <w:rPr>
           <w:color w:val="555555"/>
           <w:sz w:val="20"/>
@@ -1525,7 +1525,7 @@
       <w:pPr>
         <w:pStyle w:val="marker"/>
         <w:ind w:left="800" w:right="800"/>
-        <w:divId w:val="915238564"/>
+        <w:divId w:val="2075817173"/>
         <w:rPr>
           <w:lang w:val="nl-NL"/>
         </w:rPr>
@@ -1537,13 +1537,13 @@
     <w:p>
       <w:pPr>
         <w:pStyle w:val="Kop2"/>
-        <w:divId w:val="915238564"/>
+        <w:divId w:val="2075817173"/>
         <w:rPr>
           <w:rFonts w:eastAsia="Times New Roman"/>
           <w:lang w:val="nl-NL"/>
         </w:rPr>
       </w:pPr>
-      <w:bookmarkStart w:id="2" w:name="_Toc241651042"/>
+      <w:bookmarkStart w:id="2" w:name="_Toc241652510"/>
       <w:r>
         <w:rPr>
           <w:rFonts w:eastAsia="Times New Roman"/>
@@ -1556,7 +1556,7 @@
     <w:p>
       <w:pPr>
         <w:pStyle w:val="Normaalweb"/>
-        <w:divId w:val="915238564"/>
+        <w:divId w:val="2075817173"/>
         <w:rPr>
           <w:lang w:val="nl-NL"/>
         </w:rPr>
@@ -1571,7 +1571,7 @@
     <w:p>
       <w:pPr>
         <w:pStyle w:val="Normaalweb"/>
-        <w:divId w:val="915238564"/>
+        <w:divId w:val="2075817173"/>
         <w:rPr>
           <w:lang w:val="nl-NL"/>
         </w:rPr>
@@ -1586,7 +1586,7 @@
     <w:p>
       <w:pPr>
         <w:pStyle w:val="Normaalweb"/>
-        <w:divId w:val="915238564"/>
+        <w:divId w:val="2075817173"/>
         <w:rPr>
           <w:lang w:val="nl-NL"/>
         </w:rPr>
@@ -1601,13 +1601,13 @@
     <w:p>
       <w:pPr>
         <w:pStyle w:val="Kop2"/>
-        <w:divId w:val="915238564"/>
+        <w:divId w:val="2075817173"/>
         <w:rPr>
           <w:rFonts w:eastAsia="Times New Roman"/>
           <w:lang w:val="nl-NL"/>
         </w:rPr>
       </w:pPr>
-      <w:bookmarkStart w:id="3" w:name="_Toc241651043"/>
+      <w:bookmarkStart w:id="3" w:name="_Toc241652511"/>
       <w:r>
         <w:rPr>
           <w:rFonts w:eastAsia="Times New Roman"/>
@@ -1620,7 +1620,7 @@
     <w:p>
       <w:pPr>
         <w:pStyle w:val="Normaalweb"/>
-        <w:divId w:val="915238564"/>
+        <w:divId w:val="2075817173"/>
         <w:rPr>
           <w:lang w:val="nl-NL"/>
         </w:rPr>
@@ -1635,13 +1635,13 @@
     <w:p>
       <w:pPr>
         <w:pStyle w:val="Kop2"/>
-        <w:divId w:val="915238564"/>
+        <w:divId w:val="2075817173"/>
         <w:rPr>
           <w:rFonts w:eastAsia="Times New Roman"/>
           <w:lang w:val="nl-NL"/>
         </w:rPr>
       </w:pPr>
-      <w:bookmarkStart w:id="4" w:name="_Toc241651044"/>
+      <w:bookmarkStart w:id="4" w:name="_Toc241652512"/>
       <w:r>
         <w:rPr>
           <w:rFonts w:eastAsia="Times New Roman"/>
@@ -1654,7 +1654,7 @@
     <w:p>
       <w:pPr>
         <w:pStyle w:val="Normaalweb"/>
-        <w:divId w:val="915238564"/>
+        <w:divId w:val="2075817173"/>
         <w:rPr>
           <w:lang w:val="nl-NL"/>
         </w:rPr>
@@ -1669,13 +1669,13 @@
     <w:p>
       <w:pPr>
         <w:pStyle w:val="Kop3"/>
-        <w:divId w:val="915238564"/>
+        <w:divId w:val="2075817173"/>
         <w:rPr>
           <w:rFonts w:eastAsia="Times New Roman"/>
           <w:lang w:val="nl-NL"/>
         </w:rPr>
       </w:pPr>
-      <w:bookmarkStart w:id="5" w:name="_Toc241651045"/>
+      <w:bookmarkStart w:id="5" w:name="_Toc241652513"/>
       <w:r>
         <w:rPr>
           <w:rFonts w:eastAsia="Times New Roman"/>
@@ -1688,7 +1688,7 @@
     <w:p>
       <w:pPr>
         <w:pStyle w:val="Normaalweb"/>
-        <w:divId w:val="915238564"/>
+        <w:divId w:val="2075817173"/>
         <w:rPr>
           <w:lang w:val="nl-NL"/>
         </w:rPr>
@@ -1703,13 +1703,13 @@
     <w:p>
       <w:pPr>
         <w:pStyle w:val="Kop3"/>
-        <w:divId w:val="915238564"/>
+        <w:divId w:val="2075817173"/>
         <w:rPr>
           <w:rFonts w:eastAsia="Times New Roman"/>
           <w:lang w:val="nl-NL"/>
         </w:rPr>
       </w:pPr>
-      <w:bookmarkStart w:id="6" w:name="_Toc241651046"/>
+      <w:bookmarkStart w:id="6" w:name="_Toc241652514"/>
       <w:r>
         <w:rPr>
           <w:rFonts w:eastAsia="Times New Roman"/>
@@ -1722,7 +1722,7 @@
     <w:p>
       <w:pPr>
         <w:pStyle w:val="Normaalweb"/>
-        <w:divId w:val="915238564"/>
+        <w:divId w:val="2075817173"/>
         <w:rPr>
           <w:lang w:val="nl-NL"/>
         </w:rPr>
@@ -1737,13 +1737,13 @@
     <w:p>
       <w:pPr>
         <w:pStyle w:val="Kop3"/>
-        <w:divId w:val="915238564"/>
+        <w:divId w:val="2075817173"/>
         <w:rPr>
           <w:rFonts w:eastAsia="Times New Roman"/>
           <w:lang w:val="nl-NL"/>
         </w:rPr>
       </w:pPr>
-      <w:bookmarkStart w:id="7" w:name="_Toc241651047"/>
+      <w:bookmarkStart w:id="7" w:name="_Toc241652515"/>
       <w:r>
         <w:rPr>
           <w:rFonts w:eastAsia="Times New Roman"/>
@@ -1756,7 +1756,7 @@
     <w:p>
       <w:pPr>
         <w:pStyle w:val="Normaalweb"/>
-        <w:divId w:val="915238564"/>
+        <w:divId w:val="2075817173"/>
         <w:rPr>
           <w:lang w:val="nl-NL"/>
         </w:rPr>
@@ -1771,13 +1771,13 @@
     <w:p>
       <w:pPr>
         <w:pStyle w:val="Kop3"/>
-        <w:divId w:val="915238564"/>
+        <w:divId w:val="2075817173"/>
         <w:rPr>
           <w:rFonts w:eastAsia="Times New Roman"/>
           <w:lang w:val="nl-NL"/>
         </w:rPr>
       </w:pPr>
-      <w:bookmarkStart w:id="8" w:name="_Toc241651048"/>
+      <w:bookmarkStart w:id="8" w:name="_Toc241652516"/>
       <w:r>
         <w:rPr>
           <w:rFonts w:eastAsia="Times New Roman"/>
@@ -1790,7 +1790,7 @@
     <w:p>
       <w:pPr>
         <w:pStyle w:val="Normaalweb"/>
-        <w:divId w:val="915238564"/>
+        <w:divId w:val="2075817173"/>
         <w:rPr>
           <w:lang w:val="nl-NL"/>
         </w:rPr>
@@ -1806,13 +1806,13 @@
     <w:p>
       <w:pPr>
         <w:pStyle w:val="Kop2"/>
-        <w:divId w:val="915238564"/>
+        <w:divId w:val="2075817173"/>
         <w:rPr>
           <w:rFonts w:eastAsia="Times New Roman"/>
           <w:lang w:val="nl-NL"/>
         </w:rPr>
       </w:pPr>
-      <w:bookmarkStart w:id="9" w:name="_Toc241651049"/>
+      <w:bookmarkStart w:id="9" w:name="_Toc241652517"/>
       <w:r>
         <w:rPr>
           <w:rFonts w:eastAsia="Times New Roman"/>
@@ -1825,7 +1825,7 @@
     <w:p>
       <w:pPr>
         <w:pStyle w:val="Normaalweb"/>
-        <w:divId w:val="915238564"/>
+        <w:divId w:val="2075817173"/>
         <w:rPr>
           <w:lang w:val="nl-NL"/>
         </w:rPr>
@@ -1840,7 +1840,7 @@
     <w:p>
       <w:pPr>
         <w:pStyle w:val="Normaalweb"/>
-        <w:divId w:val="915238564"/>
+        <w:divId w:val="2075817173"/>
         <w:rPr>
           <w:lang w:val="nl-NL"/>
         </w:rPr>
@@ -1855,7 +1855,7 @@
     <w:p>
       <w:pPr>
         <w:pStyle w:val="Normaalweb"/>
-        <w:divId w:val="915238564"/>
+        <w:divId w:val="2075817173"/>
         <w:rPr>
           <w:lang w:val="nl-NL"/>
         </w:rPr>
@@ -1870,13 +1870,13 @@
     <w:p>
       <w:pPr>
         <w:pStyle w:val="Kop2"/>
-        <w:divId w:val="915238564"/>
+        <w:divId w:val="2075817173"/>
         <w:rPr>
           <w:rFonts w:eastAsia="Times New Roman"/>
           <w:lang w:val="nl-NL"/>
         </w:rPr>
       </w:pPr>
-      <w:bookmarkStart w:id="10" w:name="_Toc241651050"/>
+      <w:bookmarkStart w:id="10" w:name="_Toc241652518"/>
       <w:r>
         <w:rPr>
           <w:rFonts w:eastAsia="Times New Roman"/>
@@ -1889,7 +1889,7 @@
     <w:p>
       <w:pPr>
         <w:pStyle w:val="Normaalweb"/>
-        <w:divId w:val="915238564"/>
+        <w:divId w:val="2075817173"/>
         <w:rPr>
           <w:lang w:val="nl-NL"/>
         </w:rPr>
@@ -1904,7 +1904,7 @@
     <w:p>
       <w:pPr>
         <w:pStyle w:val="Normaalweb"/>
-        <w:divId w:val="915238564"/>
+        <w:divId w:val="2075817173"/>
         <w:rPr>
           <w:lang w:val="nl-NL"/>
         </w:rPr>
@@ -1919,13 +1919,13 @@
     <w:p>
       <w:pPr>
         <w:pStyle w:val="Kop2"/>
-        <w:divId w:val="915238564"/>
+        <w:divId w:val="2075817173"/>
         <w:rPr>
           <w:rFonts w:eastAsia="Times New Roman"/>
           <w:lang w:val="nl-NL"/>
         </w:rPr>
       </w:pPr>
-      <w:bookmarkStart w:id="11" w:name="_Toc241651051"/>
+      <w:bookmarkStart w:id="11" w:name="_Toc241652519"/>
       <w:r>
         <w:rPr>
           <w:rFonts w:eastAsia="Times New Roman"/>
@@ -1938,7 +1938,7 @@
     <w:p>
       <w:pPr>
         <w:pStyle w:val="Normaalweb"/>
-        <w:divId w:val="915238564"/>
+        <w:divId w:val="2075817173"/>
         <w:rPr>
           <w:lang w:val="nl-NL"/>
         </w:rPr>
@@ -1953,7 +1953,7 @@
     <w:p>
       <w:pPr>
         <w:pStyle w:val="Normaalweb"/>
-        <w:divId w:val="915238564"/>
+        <w:divId w:val="2075817173"/>
         <w:rPr>
           <w:lang w:val="nl-NL"/>
         </w:rPr>
@@ -1969,7 +1969,7 @@
       <w:pPr>
         <w:shd w:val="clear" w:color="auto" w:fill="FFFFFF"/>
         <w:jc w:val="both"/>
-        <w:divId w:val="538393058"/>
+        <w:divId w:val="1555235940"/>
         <w:rPr>
           <w:szCs w:val="22"/>
           <w:lang w:val="nl-NL"/>
@@ -2237,7 +2237,7 @@
         <w:sz w:val="18"/>
       </w:rPr>
       <w:tab/>
-      <w:t>Laatst gewijzigd: 30 september 2026</w:t>
+      <w:t>Laatst gewijzigd: 30 september 2026, 09:20</w:t>
     </w:r>
   </w:p>
 </w:hdr>
@@ -3489,7 +3489,7 @@
     <w:link w:val="KoptekstChar"/>
     <w:uiPriority w:val="99"/>
     <w:unhideWhenUsed/>
-    <w:rsid w:val="00CC2376"/>
+    <w:rsid w:val="000D20D4"/>
     <w:pPr>
       <w:tabs>
         <w:tab w:val="center" w:pos="4536"/>
@@ -3502,7 +3502,7 @@
     <w:basedOn w:val="Standaardalinea-lettertype"/>
     <w:link w:val="Koptekst"/>
     <w:uiPriority w:val="99"/>
-    <w:rsid w:val="00CC2376"/>
+    <w:rsid w:val="000D20D4"/>
     <w:rPr>
       <w:rFonts w:eastAsiaTheme="minorEastAsia"/>
       <w:sz w:val="24"/>
@@ -3515,7 +3515,7 @@
     <w:link w:val="VoettekstChar"/>
     <w:uiPriority w:val="99"/>
     <w:unhideWhenUsed/>
-    <w:rsid w:val="00CC2376"/>
+    <w:rsid w:val="000D20D4"/>
     <w:pPr>
       <w:tabs>
         <w:tab w:val="center" w:pos="4536"/>
@@ -3528,7 +3528,7 @@
     <w:basedOn w:val="Standaardalinea-lettertype"/>
     <w:link w:val="Voettekst"/>
     <w:uiPriority w:val="99"/>
-    <w:rsid w:val="00CC2376"/>
+    <w:rsid w:val="000D20D4"/>
     <w:rPr>
       <w:rFonts w:eastAsiaTheme="minorEastAsia"/>
       <w:sz w:val="24"/>
@@ -3542,7 +3542,7 @@
     <w:autoRedefine/>
     <w:uiPriority w:val="39"/>
     <w:unhideWhenUsed/>
-    <w:rsid w:val="00CC2376"/>
+    <w:rsid w:val="000D20D4"/>
     <w:pPr>
       <w:spacing w:after="100"/>
       <w:ind w:left="220"/>
@@ -3555,7 +3555,7 @@
     <w:autoRedefine/>
     <w:uiPriority w:val="39"/>
     <w:unhideWhenUsed/>
-    <w:rsid w:val="00CC2376"/>
+    <w:rsid w:val="000D20D4"/>
     <w:pPr>
       <w:spacing w:after="100"/>
       <w:ind w:left="440"/>

</xml_diff>

<commit_message>
Update Systeem-Audit 01-10-2026 13:02
</commit_message>
<xml_diff>
--- a/docx/document-0.docx
+++ b/docx/document-0.docx
@@ -7,7 +7,7 @@
         <w:spacing w:after="480"/>
         <w:jc w:val="center"/>
         <w:outlineLvl w:val="1"/>
-        <w:divId w:val="982395197"/>
+        <w:divId w:val="1408964286"/>
         <w:rPr>
           <w:rFonts w:ascii="Aptos Display" w:eastAsia="Times New Roman" w:hAnsi="Aptos Display"/>
           <w:b/>
@@ -36,7 +36,7 @@
     <w:p>
       <w:pPr>
         <w:pStyle w:val="ondertitel2"/>
-        <w:divId w:val="982395197"/>
+        <w:divId w:val="1408964286"/>
         <w:rPr>
           <w:lang w:val="nl-NL"/>
         </w:rPr>
@@ -51,7 +51,7 @@
     <w:p>
       <w:pPr>
         <w:pStyle w:val="documentaanduiding2"/>
-        <w:divId w:val="982395197"/>
+        <w:divId w:val="1408964286"/>
         <w:rPr>
           <w:lang w:val="nl-NL"/>
         </w:rPr>
@@ -66,7 +66,7 @@
     <w:p>
       <w:pPr>
         <w:pStyle w:val="auteur2"/>
-        <w:divId w:val="982395197"/>
+        <w:divId w:val="1408964286"/>
         <w:rPr>
           <w:lang w:val="nl-NL"/>
         </w:rPr>
@@ -81,23 +81,23 @@
     <w:p>
       <w:pPr>
         <w:pStyle w:val="meta-lijn2"/>
-        <w:divId w:val="982395197"/>
-        <w:rPr>
-          <w:lang w:val="nl-NL"/>
-        </w:rPr>
-      </w:pPr>
-      <w:r>
-        <w:rPr>
-          <w:lang w:val="nl-NL"/>
-        </w:rPr>
-        <w:t>Versie bijgewerkt: 30 september 2026, 09:20</w:t>
+        <w:divId w:val="1408964286"/>
+        <w:rPr>
+          <w:lang w:val="nl-NL"/>
+        </w:rPr>
+      </w:pPr>
+      <w:r>
+        <w:rPr>
+          <w:lang w:val="nl-NL"/>
+        </w:rPr>
+        <w:t>Versie bijgewerkt: 1 oktober 2026, 13:02</w:t>
       </w:r>
     </w:p>
     <w:p>
       <w:pPr>
         <w:pStyle w:val="marker"/>
         <w:ind w:left="800" w:right="800"/>
-        <w:divId w:val="2075817173"/>
+        <w:divId w:val="657154799"/>
         <w:rPr>
           <w:lang w:val="nl-NL"/>
         </w:rPr>
@@ -110,13 +110,13 @@
       <w:pPr>
         <w:pStyle w:val="Kop2"/>
         <w:pageBreakBefore/>
-        <w:divId w:val="214781378"/>
+        <w:divId w:val="61294296"/>
         <w:rPr>
           <w:rFonts w:eastAsia="Times New Roman"/>
           <w:lang w:val="nl-NL"/>
         </w:rPr>
       </w:pPr>
-      <w:bookmarkStart w:id="0" w:name="_Toc241652508"/>
+      <w:bookmarkStart w:id="0" w:name="_Toc241752273"/>
       <w:r>
         <w:rPr>
           <w:rFonts w:eastAsia="Times New Roman"/>
@@ -133,7 +133,7 @@
         <w:tabs>
           <w:tab w:val="right" w:leader="dot" w:pos="9062"/>
         </w:tabs>
-        <w:divId w:val="214781378"/>
+        <w:divId w:val="61294296"/>
         <w:rPr>
           <w:rFonts w:asciiTheme="minorHAnsi" w:hAnsiTheme="minorHAnsi" w:cstheme="minorBidi"/>
           <w:noProof/>
@@ -184,7 +184,7 @@
         <w:rPr>
           <w:noProof/>
         </w:rPr>
-        <w:instrText xml:space="preserve"> PAGEREF _Toc241652508 \h </w:instrText>
+        <w:instrText xml:space="preserve"> PAGEREF _Toc241752273 \h </w:instrText>
       </w:r>
       <w:r>
         <w:rPr>
@@ -216,7 +216,7 @@
         <w:tabs>
           <w:tab w:val="right" w:leader="dot" w:pos="9062"/>
         </w:tabs>
-        <w:divId w:val="214781378"/>
+        <w:divId w:val="61294296"/>
         <w:rPr>
           <w:rFonts w:asciiTheme="minorHAnsi" w:hAnsiTheme="minorHAnsi" w:cstheme="minorBidi"/>
           <w:noProof/>
@@ -249,7 +249,7 @@
         <w:rPr>
           <w:noProof/>
         </w:rPr>
-        <w:instrText xml:space="preserve"> PAGEREF _Toc241652509 \h </w:instrText>
+        <w:instrText xml:space="preserve"> PAGEREF _Toc241752274 \h </w:instrText>
       </w:r>
       <w:r>
         <w:rPr>
@@ -281,7 +281,7 @@
         <w:tabs>
           <w:tab w:val="right" w:leader="dot" w:pos="9062"/>
         </w:tabs>
-        <w:divId w:val="214781378"/>
+        <w:divId w:val="61294296"/>
         <w:rPr>
           <w:rFonts w:asciiTheme="minorHAnsi" w:hAnsiTheme="minorHAnsi" w:cstheme="minorBidi"/>
           <w:noProof/>
@@ -314,7 +314,7 @@
         <w:rPr>
           <w:noProof/>
         </w:rPr>
-        <w:instrText xml:space="preserve"> PAGEREF _Toc241652510 \h </w:instrText>
+        <w:instrText xml:space="preserve"> PAGEREF _Toc241752275 \h </w:instrText>
       </w:r>
       <w:r>
         <w:rPr>
@@ -346,7 +346,7 @@
         <w:tabs>
           <w:tab w:val="right" w:leader="dot" w:pos="9062"/>
         </w:tabs>
-        <w:divId w:val="214781378"/>
+        <w:divId w:val="61294296"/>
         <w:rPr>
           <w:rFonts w:asciiTheme="minorHAnsi" w:hAnsiTheme="minorHAnsi" w:cstheme="minorBidi"/>
           <w:noProof/>
@@ -379,7 +379,7 @@
         <w:rPr>
           <w:noProof/>
         </w:rPr>
-        <w:instrText xml:space="preserve"> PAGEREF _Toc241652511 \h </w:instrText>
+        <w:instrText xml:space="preserve"> PAGEREF _Toc241752276 \h </w:instrText>
       </w:r>
       <w:r>
         <w:rPr>
@@ -411,7 +411,7 @@
         <w:tabs>
           <w:tab w:val="right" w:leader="dot" w:pos="9062"/>
         </w:tabs>
-        <w:divId w:val="214781378"/>
+        <w:divId w:val="61294296"/>
         <w:rPr>
           <w:rFonts w:asciiTheme="minorHAnsi" w:hAnsiTheme="minorHAnsi" w:cstheme="minorBidi"/>
           <w:noProof/>
@@ -444,7 +444,7 @@
         <w:rPr>
           <w:noProof/>
         </w:rPr>
-        <w:instrText xml:space="preserve"> PAGEREF _Toc241652512 \h </w:instrText>
+        <w:instrText xml:space="preserve"> PAGEREF _Toc241752277 \h </w:instrText>
       </w:r>
       <w:r>
         <w:rPr>
@@ -476,7 +476,7 @@
         <w:tabs>
           <w:tab w:val="right" w:leader="dot" w:pos="9062"/>
         </w:tabs>
-        <w:divId w:val="214781378"/>
+        <w:divId w:val="61294296"/>
         <w:rPr>
           <w:rFonts w:asciiTheme="minorHAnsi" w:hAnsiTheme="minorHAnsi" w:cstheme="minorBidi"/>
           <w:noProof/>
@@ -509,7 +509,7 @@
         <w:rPr>
           <w:noProof/>
         </w:rPr>
-        <w:instrText xml:space="preserve"> PAGEREF _Toc241652513 \h </w:instrText>
+        <w:instrText xml:space="preserve"> PAGEREF _Toc241752278 \h </w:instrText>
       </w:r>
       <w:r>
         <w:rPr>
@@ -541,7 +541,7 @@
         <w:tabs>
           <w:tab w:val="right" w:leader="dot" w:pos="9062"/>
         </w:tabs>
-        <w:divId w:val="214781378"/>
+        <w:divId w:val="61294296"/>
         <w:rPr>
           <w:rFonts w:asciiTheme="minorHAnsi" w:hAnsiTheme="minorHAnsi" w:cstheme="minorBidi"/>
           <w:noProof/>
@@ -574,7 +574,7 @@
         <w:rPr>
           <w:noProof/>
         </w:rPr>
-        <w:instrText xml:space="preserve"> PAGEREF _Toc241652514 \h </w:instrText>
+        <w:instrText xml:space="preserve"> PAGEREF _Toc241752279 \h </w:instrText>
       </w:r>
       <w:r>
         <w:rPr>
@@ -606,7 +606,7 @@
         <w:tabs>
           <w:tab w:val="right" w:leader="dot" w:pos="9062"/>
         </w:tabs>
-        <w:divId w:val="214781378"/>
+        <w:divId w:val="61294296"/>
         <w:rPr>
           <w:rFonts w:asciiTheme="minorHAnsi" w:hAnsiTheme="minorHAnsi" w:cstheme="minorBidi"/>
           <w:noProof/>
@@ -639,7 +639,7 @@
         <w:rPr>
           <w:noProof/>
         </w:rPr>
-        <w:instrText xml:space="preserve"> PAGEREF _Toc241652515 \h </w:instrText>
+        <w:instrText xml:space="preserve"> PAGEREF _Toc241752280 \h </w:instrText>
       </w:r>
       <w:r>
         <w:rPr>
@@ -671,7 +671,7 @@
         <w:tabs>
           <w:tab w:val="right" w:leader="dot" w:pos="9062"/>
         </w:tabs>
-        <w:divId w:val="214781378"/>
+        <w:divId w:val="61294296"/>
         <w:rPr>
           <w:rFonts w:asciiTheme="minorHAnsi" w:hAnsiTheme="minorHAnsi" w:cstheme="minorBidi"/>
           <w:noProof/>
@@ -704,7 +704,7 @@
         <w:rPr>
           <w:noProof/>
         </w:rPr>
-        <w:instrText xml:space="preserve"> PAGEREF _Toc241652516 \h </w:instrText>
+        <w:instrText xml:space="preserve"> PAGEREF _Toc241752281 \h </w:instrText>
       </w:r>
       <w:r>
         <w:rPr>
@@ -736,7 +736,7 @@
         <w:tabs>
           <w:tab w:val="right" w:leader="dot" w:pos="9062"/>
         </w:tabs>
-        <w:divId w:val="214781378"/>
+        <w:divId w:val="61294296"/>
         <w:rPr>
           <w:rFonts w:asciiTheme="minorHAnsi" w:hAnsiTheme="minorHAnsi" w:cstheme="minorBidi"/>
           <w:noProof/>
@@ -769,7 +769,7 @@
         <w:rPr>
           <w:noProof/>
         </w:rPr>
-        <w:instrText xml:space="preserve"> PAGEREF _Toc241652517 \h </w:instrText>
+        <w:instrText xml:space="preserve"> PAGEREF _Toc241752282 \h </w:instrText>
       </w:r>
       <w:r>
         <w:rPr>
@@ -801,7 +801,7 @@
         <w:tabs>
           <w:tab w:val="right" w:leader="dot" w:pos="9062"/>
         </w:tabs>
-        <w:divId w:val="214781378"/>
+        <w:divId w:val="61294296"/>
         <w:rPr>
           <w:rFonts w:asciiTheme="minorHAnsi" w:hAnsiTheme="minorHAnsi" w:cstheme="minorBidi"/>
           <w:noProof/>
@@ -834,7 +834,7 @@
         <w:rPr>
           <w:noProof/>
         </w:rPr>
-        <w:instrText xml:space="preserve"> PAGEREF _Toc241652518 \h </w:instrText>
+        <w:instrText xml:space="preserve"> PAGEREF _Toc241752283 \h </w:instrText>
       </w:r>
       <w:r>
         <w:rPr>
@@ -866,7 +866,7 @@
         <w:tabs>
           <w:tab w:val="right" w:leader="dot" w:pos="9062"/>
         </w:tabs>
-        <w:divId w:val="214781378"/>
+        <w:divId w:val="61294296"/>
         <w:rPr>
           <w:rFonts w:asciiTheme="minorHAnsi" w:hAnsiTheme="minorHAnsi" w:cstheme="minorBidi"/>
           <w:noProof/>
@@ -899,7 +899,7 @@
         <w:rPr>
           <w:noProof/>
         </w:rPr>
-        <w:instrText xml:space="preserve"> PAGEREF _Toc241652519 \h </w:instrText>
+        <w:instrText xml:space="preserve"> PAGEREF _Toc241752284 \h </w:instrText>
       </w:r>
       <w:r>
         <w:rPr>
@@ -928,7 +928,7 @@
     <w:p>
       <w:pPr>
         <w:pStyle w:val="marker"/>
-        <w:divId w:val="214781378"/>
+        <w:divId w:val="61294296"/>
         <w:rPr>
           <w:lang w:val="nl-NL"/>
         </w:rPr>
@@ -944,7 +944,7 @@
       <w:pPr>
         <w:pStyle w:val="marker"/>
         <w:ind w:left="800" w:right="800"/>
-        <w:divId w:val="2075817173"/>
+        <w:divId w:val="657154799"/>
         <w:rPr>
           <w:lang w:val="nl-NL"/>
         </w:rPr>
@@ -956,13 +956,13 @@
     <w:p>
       <w:pPr>
         <w:pStyle w:val="Kop2"/>
-        <w:divId w:val="2075817173"/>
+        <w:divId w:val="657154799"/>
         <w:rPr>
           <w:rFonts w:eastAsia="Times New Roman"/>
           <w:lang w:val="nl-NL"/>
         </w:rPr>
       </w:pPr>
-      <w:bookmarkStart w:id="1" w:name="_Toc241652509"/>
+      <w:bookmarkStart w:id="1" w:name="_Toc241752274"/>
       <w:r>
         <w:rPr>
           <w:rFonts w:eastAsia="Times New Roman"/>
@@ -975,7 +975,7 @@
     <w:p>
       <w:pPr>
         <w:pStyle w:val="Normaalweb"/>
-        <w:divId w:val="2075817173"/>
+        <w:divId w:val="657154799"/>
         <w:rPr>
           <w:lang w:val="nl-NL"/>
         </w:rPr>
@@ -990,7 +990,7 @@
     <w:p>
       <w:pPr>
         <w:pStyle w:val="Normaalweb"/>
-        <w:divId w:val="2075817173"/>
+        <w:divId w:val="657154799"/>
         <w:rPr>
           <w:lang w:val="nl-NL"/>
         </w:rPr>
@@ -1018,7 +1018,7 @@
     <w:p>
       <w:pPr>
         <w:pStyle w:val="Normaalweb"/>
-        <w:divId w:val="2075817173"/>
+        <w:divId w:val="657154799"/>
         <w:rPr>
           <w:lang w:val="nl-NL"/>
         </w:rPr>
@@ -1039,7 +1039,7 @@
     <w:p>
       <w:pPr>
         <w:pStyle w:val="Normaalweb"/>
-        <w:divId w:val="2075817173"/>
+        <w:divId w:val="657154799"/>
         <w:rPr>
           <w:lang w:val="nl-NL"/>
         </w:rPr>
@@ -1086,7 +1086,7 @@
     <w:p>
       <w:pPr>
         <w:pStyle w:val="Normaalweb"/>
-        <w:divId w:val="2075817173"/>
+        <w:divId w:val="657154799"/>
         <w:rPr>
           <w:lang w:val="nl-NL"/>
         </w:rPr>
@@ -1107,7 +1107,7 @@
     <w:p>
       <w:pPr>
         <w:pStyle w:val="Normaalweb"/>
-        <w:divId w:val="2075817173"/>
+        <w:divId w:val="657154799"/>
         <w:rPr>
           <w:lang w:val="nl-NL"/>
         </w:rPr>
@@ -1142,7 +1142,7 @@
     <w:p>
       <w:pPr>
         <w:pStyle w:val="Normaalweb"/>
-        <w:divId w:val="2075817173"/>
+        <w:divId w:val="657154799"/>
         <w:rPr>
           <w:lang w:val="nl-NL"/>
         </w:rPr>
@@ -1169,7 +1169,7 @@
     <w:p>
       <w:pPr>
         <w:pStyle w:val="Normaalweb"/>
-        <w:divId w:val="2075817173"/>
+        <w:divId w:val="657154799"/>
         <w:rPr>
           <w:lang w:val="nl-NL"/>
         </w:rPr>
@@ -1197,7 +1197,7 @@
     <w:p>
       <w:pPr>
         <w:pStyle w:val="Normaalweb"/>
-        <w:divId w:val="2075817173"/>
+        <w:divId w:val="657154799"/>
         <w:rPr>
           <w:lang w:val="nl-NL"/>
         </w:rPr>
@@ -1212,7 +1212,7 @@
     <w:p>
       <w:pPr>
         <w:pStyle w:val="Normaalweb"/>
-        <w:divId w:val="2075817173"/>
+        <w:divId w:val="657154799"/>
         <w:rPr>
           <w:lang w:val="nl-NL"/>
         </w:rPr>
@@ -1278,7 +1278,7 @@
     <w:p>
       <w:pPr>
         <w:pStyle w:val="Normaalweb"/>
-        <w:divId w:val="2075817173"/>
+        <w:divId w:val="657154799"/>
         <w:rPr>
           <w:lang w:val="nl-NL"/>
         </w:rPr>
@@ -1293,7 +1293,7 @@
     <w:p>
       <w:pPr>
         <w:pStyle w:val="Normaalweb"/>
-        <w:divId w:val="2075817173"/>
+        <w:divId w:val="657154799"/>
         <w:rPr>
           <w:lang w:val="nl-NL"/>
         </w:rPr>
@@ -1321,7 +1321,7 @@
     <w:p>
       <w:pPr>
         <w:pStyle w:val="Normaalweb"/>
-        <w:divId w:val="2075817173"/>
+        <w:divId w:val="657154799"/>
         <w:rPr>
           <w:lang w:val="nl-NL"/>
         </w:rPr>
@@ -1336,7 +1336,7 @@
     <w:p>
       <w:pPr>
         <w:pStyle w:val="Normaalweb"/>
-        <w:divId w:val="2075817173"/>
+        <w:divId w:val="657154799"/>
         <w:rPr>
           <w:lang w:val="nl-NL"/>
         </w:rPr>
@@ -1351,7 +1351,7 @@
     <w:p>
       <w:pPr>
         <w:pStyle w:val="Normaalweb"/>
-        <w:divId w:val="2075817173"/>
+        <w:divId w:val="657154799"/>
         <w:rPr>
           <w:lang w:val="nl-NL"/>
         </w:rPr>
@@ -1366,7 +1366,7 @@
     <w:p>
       <w:pPr>
         <w:spacing w:before="300" w:after="200"/>
-        <w:divId w:val="2075817173"/>
+        <w:divId w:val="657154799"/>
         <w:rPr>
           <w:rFonts w:eastAsia="Times New Roman"/>
           <w:lang w:val="nl-NL"/>
@@ -1377,14 +1377,14 @@
           <w:rFonts w:eastAsia="Times New Roman"/>
           <w:lang w:val="nl-NL"/>
         </w:rPr>
-        <w:pict w14:anchorId="39FD6073">
+        <w:pict w14:anchorId="64F27031">
           <v:rect id="_x0000_i1025" style="width:0;height:1.5pt" o:hralign="center" o:hrstd="t" o:hr="t" fillcolor="#a0a0a0" stroked="f"/>
         </w:pict>
       </w:r>
     </w:p>
     <w:p>
       <w:pPr>
-        <w:divId w:val="416295621"/>
+        <w:divId w:val="2043675193"/>
         <w:rPr>
           <w:color w:val="555555"/>
           <w:sz w:val="20"/>
@@ -1423,7 +1423,7 @@
     </w:p>
     <w:p>
       <w:pPr>
-        <w:divId w:val="416295621"/>
+        <w:divId w:val="2043675193"/>
         <w:rPr>
           <w:color w:val="555555"/>
           <w:sz w:val="20"/>
@@ -1453,7 +1453,7 @@
     </w:p>
     <w:p>
       <w:pPr>
-        <w:divId w:val="416295621"/>
+        <w:divId w:val="2043675193"/>
         <w:rPr>
           <w:color w:val="555555"/>
           <w:sz w:val="20"/>
@@ -1493,7 +1493,7 @@
     </w:p>
     <w:p>
       <w:pPr>
-        <w:divId w:val="416295621"/>
+        <w:divId w:val="2043675193"/>
         <w:rPr>
           <w:color w:val="555555"/>
           <w:sz w:val="20"/>
@@ -1525,7 +1525,7 @@
       <w:pPr>
         <w:pStyle w:val="marker"/>
         <w:ind w:left="800" w:right="800"/>
-        <w:divId w:val="2075817173"/>
+        <w:divId w:val="657154799"/>
         <w:rPr>
           <w:lang w:val="nl-NL"/>
         </w:rPr>
@@ -1537,13 +1537,13 @@
     <w:p>
       <w:pPr>
         <w:pStyle w:val="Kop2"/>
-        <w:divId w:val="2075817173"/>
+        <w:divId w:val="657154799"/>
         <w:rPr>
           <w:rFonts w:eastAsia="Times New Roman"/>
           <w:lang w:val="nl-NL"/>
         </w:rPr>
       </w:pPr>
-      <w:bookmarkStart w:id="2" w:name="_Toc241652510"/>
+      <w:bookmarkStart w:id="2" w:name="_Toc241752275"/>
       <w:r>
         <w:rPr>
           <w:rFonts w:eastAsia="Times New Roman"/>
@@ -1556,7 +1556,7 @@
     <w:p>
       <w:pPr>
         <w:pStyle w:val="Normaalweb"/>
-        <w:divId w:val="2075817173"/>
+        <w:divId w:val="657154799"/>
         <w:rPr>
           <w:lang w:val="nl-NL"/>
         </w:rPr>
@@ -1571,7 +1571,7 @@
     <w:p>
       <w:pPr>
         <w:pStyle w:val="Normaalweb"/>
-        <w:divId w:val="2075817173"/>
+        <w:divId w:val="657154799"/>
         <w:rPr>
           <w:lang w:val="nl-NL"/>
         </w:rPr>
@@ -1586,7 +1586,7 @@
     <w:p>
       <w:pPr>
         <w:pStyle w:val="Normaalweb"/>
-        <w:divId w:val="2075817173"/>
+        <w:divId w:val="657154799"/>
         <w:rPr>
           <w:lang w:val="nl-NL"/>
         </w:rPr>
@@ -1601,13 +1601,13 @@
     <w:p>
       <w:pPr>
         <w:pStyle w:val="Kop2"/>
-        <w:divId w:val="2075817173"/>
+        <w:divId w:val="657154799"/>
         <w:rPr>
           <w:rFonts w:eastAsia="Times New Roman"/>
           <w:lang w:val="nl-NL"/>
         </w:rPr>
       </w:pPr>
-      <w:bookmarkStart w:id="3" w:name="_Toc241652511"/>
+      <w:bookmarkStart w:id="3" w:name="_Toc241752276"/>
       <w:r>
         <w:rPr>
           <w:rFonts w:eastAsia="Times New Roman"/>
@@ -1620,7 +1620,7 @@
     <w:p>
       <w:pPr>
         <w:pStyle w:val="Normaalweb"/>
-        <w:divId w:val="2075817173"/>
+        <w:divId w:val="657154799"/>
         <w:rPr>
           <w:lang w:val="nl-NL"/>
         </w:rPr>
@@ -1635,13 +1635,13 @@
     <w:p>
       <w:pPr>
         <w:pStyle w:val="Kop2"/>
-        <w:divId w:val="2075817173"/>
+        <w:divId w:val="657154799"/>
         <w:rPr>
           <w:rFonts w:eastAsia="Times New Roman"/>
           <w:lang w:val="nl-NL"/>
         </w:rPr>
       </w:pPr>
-      <w:bookmarkStart w:id="4" w:name="_Toc241652512"/>
+      <w:bookmarkStart w:id="4" w:name="_Toc241752277"/>
       <w:r>
         <w:rPr>
           <w:rFonts w:eastAsia="Times New Roman"/>
@@ -1654,7 +1654,7 @@
     <w:p>
       <w:pPr>
         <w:pStyle w:val="Normaalweb"/>
-        <w:divId w:val="2075817173"/>
+        <w:divId w:val="657154799"/>
         <w:rPr>
           <w:lang w:val="nl-NL"/>
         </w:rPr>
@@ -1669,13 +1669,13 @@
     <w:p>
       <w:pPr>
         <w:pStyle w:val="Kop3"/>
-        <w:divId w:val="2075817173"/>
+        <w:divId w:val="657154799"/>
         <w:rPr>
           <w:rFonts w:eastAsia="Times New Roman"/>
           <w:lang w:val="nl-NL"/>
         </w:rPr>
       </w:pPr>
-      <w:bookmarkStart w:id="5" w:name="_Toc241652513"/>
+      <w:bookmarkStart w:id="5" w:name="_Toc241752278"/>
       <w:r>
         <w:rPr>
           <w:rFonts w:eastAsia="Times New Roman"/>
@@ -1688,7 +1688,7 @@
     <w:p>
       <w:pPr>
         <w:pStyle w:val="Normaalweb"/>
-        <w:divId w:val="2075817173"/>
+        <w:divId w:val="657154799"/>
         <w:rPr>
           <w:lang w:val="nl-NL"/>
         </w:rPr>
@@ -1703,13 +1703,13 @@
     <w:p>
       <w:pPr>
         <w:pStyle w:val="Kop3"/>
-        <w:divId w:val="2075817173"/>
+        <w:divId w:val="657154799"/>
         <w:rPr>
           <w:rFonts w:eastAsia="Times New Roman"/>
           <w:lang w:val="nl-NL"/>
         </w:rPr>
       </w:pPr>
-      <w:bookmarkStart w:id="6" w:name="_Toc241652514"/>
+      <w:bookmarkStart w:id="6" w:name="_Toc241752279"/>
       <w:r>
         <w:rPr>
           <w:rFonts w:eastAsia="Times New Roman"/>
@@ -1722,7 +1722,7 @@
     <w:p>
       <w:pPr>
         <w:pStyle w:val="Normaalweb"/>
-        <w:divId w:val="2075817173"/>
+        <w:divId w:val="657154799"/>
         <w:rPr>
           <w:lang w:val="nl-NL"/>
         </w:rPr>
@@ -1737,13 +1737,13 @@
     <w:p>
       <w:pPr>
         <w:pStyle w:val="Kop3"/>
-        <w:divId w:val="2075817173"/>
+        <w:divId w:val="657154799"/>
         <w:rPr>
           <w:rFonts w:eastAsia="Times New Roman"/>
           <w:lang w:val="nl-NL"/>
         </w:rPr>
       </w:pPr>
-      <w:bookmarkStart w:id="7" w:name="_Toc241652515"/>
+      <w:bookmarkStart w:id="7" w:name="_Toc241752280"/>
       <w:r>
         <w:rPr>
           <w:rFonts w:eastAsia="Times New Roman"/>
@@ -1756,7 +1756,7 @@
     <w:p>
       <w:pPr>
         <w:pStyle w:val="Normaalweb"/>
-        <w:divId w:val="2075817173"/>
+        <w:divId w:val="657154799"/>
         <w:rPr>
           <w:lang w:val="nl-NL"/>
         </w:rPr>
@@ -1771,13 +1771,13 @@
     <w:p>
       <w:pPr>
         <w:pStyle w:val="Kop3"/>
-        <w:divId w:val="2075817173"/>
+        <w:divId w:val="657154799"/>
         <w:rPr>
           <w:rFonts w:eastAsia="Times New Roman"/>
           <w:lang w:val="nl-NL"/>
         </w:rPr>
       </w:pPr>
-      <w:bookmarkStart w:id="8" w:name="_Toc241652516"/>
+      <w:bookmarkStart w:id="8" w:name="_Toc241752281"/>
       <w:r>
         <w:rPr>
           <w:rFonts w:eastAsia="Times New Roman"/>
@@ -1790,7 +1790,7 @@
     <w:p>
       <w:pPr>
         <w:pStyle w:val="Normaalweb"/>
-        <w:divId w:val="2075817173"/>
+        <w:divId w:val="657154799"/>
         <w:rPr>
           <w:lang w:val="nl-NL"/>
         </w:rPr>
@@ -1806,13 +1806,13 @@
     <w:p>
       <w:pPr>
         <w:pStyle w:val="Kop2"/>
-        <w:divId w:val="2075817173"/>
+        <w:divId w:val="657154799"/>
         <w:rPr>
           <w:rFonts w:eastAsia="Times New Roman"/>
           <w:lang w:val="nl-NL"/>
         </w:rPr>
       </w:pPr>
-      <w:bookmarkStart w:id="9" w:name="_Toc241652517"/>
+      <w:bookmarkStart w:id="9" w:name="_Toc241752282"/>
       <w:r>
         <w:rPr>
           <w:rFonts w:eastAsia="Times New Roman"/>
@@ -1825,7 +1825,7 @@
     <w:p>
       <w:pPr>
         <w:pStyle w:val="Normaalweb"/>
-        <w:divId w:val="2075817173"/>
+        <w:divId w:val="657154799"/>
         <w:rPr>
           <w:lang w:val="nl-NL"/>
         </w:rPr>
@@ -1840,7 +1840,7 @@
     <w:p>
       <w:pPr>
         <w:pStyle w:val="Normaalweb"/>
-        <w:divId w:val="2075817173"/>
+        <w:divId w:val="657154799"/>
         <w:rPr>
           <w:lang w:val="nl-NL"/>
         </w:rPr>
@@ -1855,7 +1855,7 @@
     <w:p>
       <w:pPr>
         <w:pStyle w:val="Normaalweb"/>
-        <w:divId w:val="2075817173"/>
+        <w:divId w:val="657154799"/>
         <w:rPr>
           <w:lang w:val="nl-NL"/>
         </w:rPr>
@@ -1870,13 +1870,13 @@
     <w:p>
       <w:pPr>
         <w:pStyle w:val="Kop2"/>
-        <w:divId w:val="2075817173"/>
+        <w:divId w:val="657154799"/>
         <w:rPr>
           <w:rFonts w:eastAsia="Times New Roman"/>
           <w:lang w:val="nl-NL"/>
         </w:rPr>
       </w:pPr>
-      <w:bookmarkStart w:id="10" w:name="_Toc241652518"/>
+      <w:bookmarkStart w:id="10" w:name="_Toc241752283"/>
       <w:r>
         <w:rPr>
           <w:rFonts w:eastAsia="Times New Roman"/>
@@ -1889,7 +1889,7 @@
     <w:p>
       <w:pPr>
         <w:pStyle w:val="Normaalweb"/>
-        <w:divId w:val="2075817173"/>
+        <w:divId w:val="657154799"/>
         <w:rPr>
           <w:lang w:val="nl-NL"/>
         </w:rPr>
@@ -1904,7 +1904,7 @@
     <w:p>
       <w:pPr>
         <w:pStyle w:val="Normaalweb"/>
-        <w:divId w:val="2075817173"/>
+        <w:divId w:val="657154799"/>
         <w:rPr>
           <w:lang w:val="nl-NL"/>
         </w:rPr>
@@ -1919,13 +1919,13 @@
     <w:p>
       <w:pPr>
         <w:pStyle w:val="Kop2"/>
-        <w:divId w:val="2075817173"/>
+        <w:divId w:val="657154799"/>
         <w:rPr>
           <w:rFonts w:eastAsia="Times New Roman"/>
           <w:lang w:val="nl-NL"/>
         </w:rPr>
       </w:pPr>
-      <w:bookmarkStart w:id="11" w:name="_Toc241652519"/>
+      <w:bookmarkStart w:id="11" w:name="_Toc241752284"/>
       <w:r>
         <w:rPr>
           <w:rFonts w:eastAsia="Times New Roman"/>
@@ -1938,7 +1938,7 @@
     <w:p>
       <w:pPr>
         <w:pStyle w:val="Normaalweb"/>
-        <w:divId w:val="2075817173"/>
+        <w:divId w:val="657154799"/>
         <w:rPr>
           <w:lang w:val="nl-NL"/>
         </w:rPr>
@@ -1953,7 +1953,7 @@
     <w:p>
       <w:pPr>
         <w:pStyle w:val="Normaalweb"/>
-        <w:divId w:val="2075817173"/>
+        <w:divId w:val="657154799"/>
         <w:rPr>
           <w:lang w:val="nl-NL"/>
         </w:rPr>
@@ -1969,7 +1969,7 @@
       <w:pPr>
         <w:shd w:val="clear" w:color="auto" w:fill="FFFFFF"/>
         <w:jc w:val="both"/>
-        <w:divId w:val="1555235940"/>
+        <w:divId w:val="1268661817"/>
         <w:rPr>
           <w:szCs w:val="22"/>
           <w:lang w:val="nl-NL"/>
@@ -2145,7 +2145,7 @@
         <w:color w:val="808080"/>
         <w:sz w:val="18"/>
       </w:rPr>
-      <w:t>3</w:t>
+      <w:t>6</w:t>
     </w:r>
     <w:r>
       <w:rPr>
@@ -2237,7 +2237,7 @@
         <w:sz w:val="18"/>
       </w:rPr>
       <w:tab/>
-      <w:t>Laatst gewijzigd: 30 september 2026, 09:20</w:t>
+      <w:t>Laatst gewijzigd: 1 oktober 2026, 13:02</w:t>
     </w:r>
   </w:p>
 </w:hdr>
@@ -3489,7 +3489,7 @@
     <w:link w:val="KoptekstChar"/>
     <w:uiPriority w:val="99"/>
     <w:unhideWhenUsed/>
-    <w:rsid w:val="000D20D4"/>
+    <w:rsid w:val="00594B8C"/>
     <w:pPr>
       <w:tabs>
         <w:tab w:val="center" w:pos="4536"/>
@@ -3502,7 +3502,7 @@
     <w:basedOn w:val="Standaardalinea-lettertype"/>
     <w:link w:val="Koptekst"/>
     <w:uiPriority w:val="99"/>
-    <w:rsid w:val="000D20D4"/>
+    <w:rsid w:val="00594B8C"/>
     <w:rPr>
       <w:rFonts w:eastAsiaTheme="minorEastAsia"/>
       <w:sz w:val="24"/>
@@ -3515,7 +3515,7 @@
     <w:link w:val="VoettekstChar"/>
     <w:uiPriority w:val="99"/>
     <w:unhideWhenUsed/>
-    <w:rsid w:val="000D20D4"/>
+    <w:rsid w:val="00594B8C"/>
     <w:pPr>
       <w:tabs>
         <w:tab w:val="center" w:pos="4536"/>
@@ -3528,7 +3528,7 @@
     <w:basedOn w:val="Standaardalinea-lettertype"/>
     <w:link w:val="Voettekst"/>
     <w:uiPriority w:val="99"/>
-    <w:rsid w:val="000D20D4"/>
+    <w:rsid w:val="00594B8C"/>
     <w:rPr>
       <w:rFonts w:eastAsiaTheme="minorEastAsia"/>
       <w:sz w:val="24"/>
@@ -3542,7 +3542,7 @@
     <w:autoRedefine/>
     <w:uiPriority w:val="39"/>
     <w:unhideWhenUsed/>
-    <w:rsid w:val="000D20D4"/>
+    <w:rsid w:val="00594B8C"/>
     <w:pPr>
       <w:spacing w:after="100"/>
       <w:ind w:left="220"/>
@@ -3555,7 +3555,7 @@
     <w:autoRedefine/>
     <w:uiPriority w:val="39"/>
     <w:unhideWhenUsed/>
-    <w:rsid w:val="000D20D4"/>
+    <w:rsid w:val="00594B8C"/>
     <w:pPr>
       <w:spacing w:after="100"/>
       <w:ind w:left="440"/>

</xml_diff>